<commit_message>
Add timetable background styling
</commit_message>
<xml_diff>
--- a/STUDENT STUDY PLANNER.docx
+++ b/STUDENT STUDY PLANNER.docx
@@ -10,10 +10,7 @@
     <w:p/>
     <w:p>
       <w:r>
-        <w:t xml:space="preserve">STUDENT </w:t>
-      </w:r>
-      <w:r>
-        <w:t>DETAILS</w:t>
+        <w:t>STUDENT DETAILS</w:t>
       </w:r>
     </w:p>
     <w:p>
@@ -551,143 +548,58 @@
     </w:p>
     <w:p>
       <w:r>
-        <w:t xml:space="preserve">Node.js &amp; Express Server       | </w:t>
-      </w:r>
-      <w:r>
-        <w:rPr>
-          <w:rFonts w:ascii="Segoe UI Emoji" w:hAnsi="Segoe UI Emoji" w:cs="Segoe UI Emoji"/>
-        </w:rPr>
-        <w:t>✅</w:t>
-      </w:r>
-      <w:r>
-        <w:t xml:space="preserve"> Complete</w:t>
-      </w:r>
-    </w:p>
-    <w:p>
-      <w:r>
-        <w:t xml:space="preserve">RESTful API Endpoints          | </w:t>
-      </w:r>
-      <w:r>
-        <w:rPr>
-          <w:rFonts w:ascii="Segoe UI Emoji" w:hAnsi="Segoe UI Emoji" w:cs="Segoe UI Emoji"/>
-        </w:rPr>
-        <w:t>✅</w:t>
-      </w:r>
-      <w:r>
-        <w:t xml:space="preserve"> Complete  </w:t>
-      </w:r>
-    </w:p>
-    <w:p>
-      <w:r>
-        <w:t xml:space="preserve">CRUD Functionality             | </w:t>
-      </w:r>
-      <w:r>
-        <w:rPr>
-          <w:rFonts w:ascii="Segoe UI Emoji" w:hAnsi="Segoe UI Emoji" w:cs="Segoe UI Emoji"/>
-        </w:rPr>
-        <w:t>✅</w:t>
-      </w:r>
-      <w:r>
-        <w:t xml:space="preserve"> Complete</w:t>
-      </w:r>
-    </w:p>
-    <w:p>
-      <w:r>
-        <w:t xml:space="preserve">JWT Authentication             | </w:t>
-      </w:r>
-      <w:r>
-        <w:rPr>
-          <w:rFonts w:ascii="Segoe UI Emoji" w:hAnsi="Segoe UI Emoji" w:cs="Segoe UI Emoji"/>
-        </w:rPr>
-        <w:t>✅</w:t>
-      </w:r>
-      <w:r>
-        <w:t xml:space="preserve"> Complete</w:t>
-      </w:r>
-    </w:p>
-    <w:p>
-      <w:r>
-        <w:t xml:space="preserve">SQL Database Storage           | </w:t>
-      </w:r>
-      <w:r>
-        <w:rPr>
-          <w:rFonts w:ascii="Segoe UI Emoji" w:hAnsi="Segoe UI Emoji" w:cs="Segoe UI Emoji"/>
-        </w:rPr>
-        <w:t>✅</w:t>
-      </w:r>
-      <w:r>
-        <w:t xml:space="preserve"> Complete</w:t>
-      </w:r>
-    </w:p>
-    <w:p>
-      <w:r>
-        <w:t xml:space="preserve">Frontend consumes Backend APIs | </w:t>
-      </w:r>
-      <w:r>
-        <w:rPr>
-          <w:rFonts w:ascii="Segoe UI Emoji" w:hAnsi="Segoe UI Emoji" w:cs="Segoe UI Emoji"/>
-        </w:rPr>
-        <w:t>✅</w:t>
-      </w:r>
-      <w:r>
-        <w:t xml:space="preserve"> Complete</w:t>
+        <w:t>Node.js &amp; Express Server     Complete</w:t>
+      </w:r>
+    </w:p>
+    <w:p>
+      <w:r>
+        <w:t xml:space="preserve">RESTful API Endpoints          Complete  </w:t>
+      </w:r>
+    </w:p>
+    <w:p>
+      <w:r>
+        <w:t>CRUD Functionality              Complete</w:t>
+      </w:r>
+    </w:p>
+    <w:p>
+      <w:r>
+        <w:t>JWT Authentication             Complete</w:t>
+      </w:r>
+    </w:p>
+    <w:p>
+      <w:r>
+        <w:t>SQL Database Storage            Complete</w:t>
+      </w:r>
+    </w:p>
+    <w:p>
+      <w:r>
+        <w:t xml:space="preserve">Frontend consumes Backend </w:t>
+      </w:r>
+      <w:proofErr w:type="gramStart"/>
+      <w:r>
+        <w:t>APIs  Complete</w:t>
+      </w:r>
+      <w:proofErr w:type="gramEnd"/>
+    </w:p>
+    <w:p>
+      <w:r>
+        <w:t>CORS Configured                Complete</w:t>
       </w:r>
     </w:p>
     <w:p>
       <w:r>
         <w:lastRenderedPageBreak/>
-        <w:t xml:space="preserve">CORS Configured                | </w:t>
-      </w:r>
-      <w:r>
-        <w:rPr>
-          <w:rFonts w:ascii="Segoe UI Emoji" w:hAnsi="Segoe UI Emoji" w:cs="Segoe UI Emoji"/>
-        </w:rPr>
-        <w:t>✅</w:t>
-      </w:r>
-      <w:r>
-        <w:t xml:space="preserve"> Complete</w:t>
-      </w:r>
-    </w:p>
-    <w:p>
-      <w:r>
-        <w:t xml:space="preserve">Deployed Frontend              | </w:t>
-      </w:r>
-      <w:r>
-        <w:rPr>
-          <w:rFonts w:ascii="Segoe UI Emoji" w:hAnsi="Segoe UI Emoji" w:cs="Segoe UI Emoji"/>
-        </w:rPr>
-        <w:t>✅</w:t>
-      </w:r>
-      <w:r>
-        <w:t xml:space="preserve"> Complete</w:t>
-      </w:r>
-    </w:p>
-    <w:p>
-      <w:r>
-        <w:t xml:space="preserve">Deployed Backend              | </w:t>
-      </w:r>
-      <w:r>
-        <w:rPr>
-          <w:rFonts w:ascii="Segoe UI Emoji" w:hAnsi="Segoe UI Emoji" w:cs="Segoe UI Emoji"/>
-        </w:rPr>
-        <w:t>✅</w:t>
-      </w:r>
-      <w:r>
-        <w:t xml:space="preserve"> Complete</w:t>
-      </w:r>
-    </w:p>
-    <w:p>
-      <w:r>
-        <w:t xml:space="preserve">Live URL Accessible            | </w:t>
-      </w:r>
-      <w:r>
-        <w:rPr>
-          <w:rFonts w:ascii="Segoe UI Emoji" w:hAnsi="Segoe UI Emoji" w:cs="Segoe UI Emoji"/>
-        </w:rPr>
-        <w:t>✅</w:t>
-      </w:r>
-      <w:r>
-        <w:t xml:space="preserve"> Complete</w:t>
+        <w:t>Deployed Frontend              Complete</w:t>
+      </w:r>
+    </w:p>
+    <w:p>
+      <w:r>
+        <w:t>Deployed Backend              Complete</w:t>
+      </w:r>
+    </w:p>
+    <w:p>
+      <w:r>
+        <w:t>Live URL Accessible            Complete</w:t>
       </w:r>
     </w:p>
     <w:p/>
@@ -714,6 +626,7 @@
     <w:p/>
     <w:p/>
     <w:p/>
+    <w:p/>
     <w:p>
       <w:pPr>
         <w:rPr>
@@ -730,13 +643,7 @@
         <w:t>CHALLENGES ENCOUNTERED AND SOLUTIONS IMPLEMENTED</w:t>
       </w:r>
     </w:p>
-    <w:p>
-      <w:r>
-        <w:pict w14:anchorId="11B069F7">
-          <v:rect id="_x0000_i1091" style="width:0;height:.75pt" o:hralign="center" o:hrstd="t" o:hr="t" fillcolor="#a0a0a0" stroked="f"/>
-        </w:pict>
-      </w:r>
-    </w:p>
+    <w:p/>
     <w:p>
       <w:pPr>
         <w:rPr>
@@ -848,13 +755,6 @@
       </w:r>
     </w:p>
     <w:p>
-      <w:r>
-        <w:pict w14:anchorId="37DDDDC8">
-          <v:rect id="_x0000_i1092" style="width:0;height:.75pt" o:hralign="center" o:hrstd="t" o:hr="t" fillcolor="#a0a0a0" stroked="f"/>
-        </w:pict>
-      </w:r>
-    </w:p>
-    <w:p>
       <w:pPr>
         <w:rPr>
           <w:b/>
@@ -1020,34 +920,27 @@
         </w:numPr>
       </w:pPr>
       <w:r>
+        <w:t xml:space="preserve">Added the same variable to </w:t>
+      </w:r>
+      <w:proofErr w:type="spellStart"/>
+      <w:r>
+        <w:t>Vercel's</w:t>
+      </w:r>
+      <w:proofErr w:type="spellEnd"/>
+      <w:r>
+        <w:t xml:space="preserve"> Environment Variables dashboard</w:t>
+      </w:r>
+    </w:p>
+    <w:p>
+      <w:pPr>
+        <w:numPr>
+          <w:ilvl w:val="0"/>
+          <w:numId w:val="2"/>
+        </w:numPr>
+      </w:pPr>
+      <w:r>
         <w:lastRenderedPageBreak/>
-        <w:t xml:space="preserve">Added the same variable to </w:t>
-      </w:r>
-      <w:proofErr w:type="spellStart"/>
-      <w:r>
-        <w:t>Vercel's</w:t>
-      </w:r>
-      <w:proofErr w:type="spellEnd"/>
-      <w:r>
-        <w:t xml:space="preserve"> Environment Variables dashboard</w:t>
-      </w:r>
-    </w:p>
-    <w:p>
-      <w:pPr>
-        <w:numPr>
-          <w:ilvl w:val="0"/>
-          <w:numId w:val="2"/>
-        </w:numPr>
-      </w:pPr>
-      <w:r>
         <w:t>Temporarily hardcoded the URL to confirm connectivity before finalizing the variable approach</w:t>
-      </w:r>
-    </w:p>
-    <w:p>
-      <w:r>
-        <w:pict w14:anchorId="55920C35">
-          <v:rect id="_x0000_i1093" style="width:0;height:.75pt" o:hralign="center" o:hrstd="t" o:hr="t" fillcolor="#a0a0a0" stroked="f"/>
-        </w:pict>
       </w:r>
     </w:p>
     <w:p>
@@ -1186,13 +1079,6 @@
       </w:r>
     </w:p>
     <w:p>
-      <w:r>
-        <w:pict w14:anchorId="5EEB4331">
-          <v:rect id="_x0000_i1094" style="width:0;height:.75pt" o:hralign="center" o:hrstd="t" o:hr="t" fillcolor="#a0a0a0" stroked="f"/>
-        </w:pict>
-      </w:r>
-    </w:p>
-    <w:p>
       <w:pPr>
         <w:rPr>
           <w:b/>
@@ -1307,7 +1193,6 @@
         </w:numPr>
       </w:pPr>
       <w:r>
-        <w:lastRenderedPageBreak/>
         <w:t>Added </w:t>
       </w:r>
       <w:proofErr w:type="spellStart"/>
@@ -1370,24 +1255,18 @@
       </w:r>
     </w:p>
     <w:p>
-      <w:r>
-        <w:pict w14:anchorId="027D84E6">
-          <v:rect id="_x0000_i1095" style="width:0;height:.75pt" o:hralign="center" o:hrstd="t" o:hr="t" fillcolor="#a0a0a0" stroked="f"/>
-        </w:pict>
-      </w:r>
-    </w:p>
-    <w:p>
-      <w:pPr>
-        <w:rPr>
-          <w:b/>
-          <w:bCs/>
-        </w:rPr>
-      </w:pPr>
-      <w:r>
-        <w:rPr>
-          <w:b/>
-          <w:bCs/>
-        </w:rPr>
+      <w:pPr>
+        <w:rPr>
+          <w:b/>
+          <w:bCs/>
+        </w:rPr>
+      </w:pPr>
+      <w:r>
+        <w:rPr>
+          <w:b/>
+          <w:bCs/>
+        </w:rPr>
+        <w:lastRenderedPageBreak/>
         <w:t xml:space="preserve">CHALLENGE 5: </w:t>
       </w:r>
       <w:proofErr w:type="spellStart"/>
@@ -1520,13 +1399,6 @@
       </w:r>
     </w:p>
     <w:p>
-      <w:r>
-        <w:pict w14:anchorId="246013B8">
-          <v:rect id="_x0000_i1096" style="width:0;height:.75pt" o:hralign="center" o:hrstd="t" o:hr="t" fillcolor="#a0a0a0" stroked="f"/>
-        </w:pict>
-      </w:r>
-    </w:p>
-    <w:p>
       <w:pPr>
         <w:rPr>
           <w:b/>
@@ -1719,57 +1591,50 @@
         </w:numPr>
       </w:pPr>
       <w:r>
+        <w:t xml:space="preserve">Once confirmed, set it back to allow only the production </w:t>
+      </w:r>
+      <w:proofErr w:type="spellStart"/>
+      <w:r>
+        <w:t>Vercel</w:t>
+      </w:r>
+      <w:proofErr w:type="spellEnd"/>
+      <w:r>
+        <w:t xml:space="preserve"> URL and localhost for development</w:t>
+      </w:r>
+    </w:p>
+    <w:p>
+      <w:pPr>
+        <w:numPr>
+          <w:ilvl w:val="0"/>
+          <w:numId w:val="6"/>
+        </w:numPr>
+      </w:pPr>
+      <w:r>
+        <w:t>Added credentials: true to allow session cookies if needed in the future</w:t>
+      </w:r>
+    </w:p>
+    <w:p>
+      <w:pPr>
+        <w:rPr>
+          <w:b/>
+          <w:bCs/>
+        </w:rPr>
+      </w:pPr>
+      <w:r>
+        <w:rPr>
+          <w:b/>
+          <w:bCs/>
+        </w:rPr>
+        <w:t>CHALLENGE 7: Build Failures Due to Missing Dependencies</w:t>
+      </w:r>
+    </w:p>
+    <w:p>
+      <w:r>
+        <w:rPr>
+          <w:b/>
+          <w:bCs/>
+        </w:rPr>
         <w:lastRenderedPageBreak/>
-        <w:t xml:space="preserve">Once confirmed, set it back to allow only the production </w:t>
-      </w:r>
-      <w:proofErr w:type="spellStart"/>
-      <w:r>
-        <w:t>Vercel</w:t>
-      </w:r>
-      <w:proofErr w:type="spellEnd"/>
-      <w:r>
-        <w:t xml:space="preserve"> URL and localhost for development</w:t>
-      </w:r>
-    </w:p>
-    <w:p>
-      <w:pPr>
-        <w:numPr>
-          <w:ilvl w:val="0"/>
-          <w:numId w:val="6"/>
-        </w:numPr>
-      </w:pPr>
-      <w:r>
-        <w:t>Added credentials: true to allow session cookies if needed in the future</w:t>
-      </w:r>
-    </w:p>
-    <w:p>
-      <w:r>
-        <w:pict w14:anchorId="14E13B1D">
-          <v:rect id="_x0000_i1097" style="width:0;height:.75pt" o:hralign="center" o:hrstd="t" o:hr="t" fillcolor="#a0a0a0" stroked="f"/>
-        </w:pict>
-      </w:r>
-    </w:p>
-    <w:p>
-      <w:pPr>
-        <w:rPr>
-          <w:b/>
-          <w:bCs/>
-        </w:rPr>
-      </w:pPr>
-      <w:r>
-        <w:rPr>
-          <w:b/>
-          <w:bCs/>
-        </w:rPr>
-        <w:t>CHALLENGE 7: Build Failures Due to Missing Dependencies</w:t>
-      </w:r>
-    </w:p>
-    <w:p>
-      <w:r>
-        <w:rPr>
-          <w:b/>
-          <w:bCs/>
-        </w:rPr>
         <w:t>Problem Encountered:</w:t>
       </w:r>
       <w:r>
@@ -1919,13 +1784,6 @@
       </w:r>
     </w:p>
     <w:p>
-      <w:r>
-        <w:pict w14:anchorId="1FA573AC">
-          <v:rect id="_x0000_i1098" style="width:0;height:.75pt" o:hralign="center" o:hrstd="t" o:hr="t" fillcolor="#a0a0a0" stroked="f"/>
-        </w:pict>
-      </w:r>
-    </w:p>
-    <w:p>
       <w:pPr>
         <w:rPr>
           <w:b/>
@@ -2041,25 +1899,17 @@
       </w:r>
     </w:p>
     <w:p>
-      <w:r>
-        <w:pict w14:anchorId="29534070">
-          <v:rect id="_x0000_i1099" style="width:0;height:.75pt" o:hralign="center" o:hrstd="t" o:hr="t" fillcolor="#a0a0a0" stroked="f"/>
-        </w:pict>
-      </w:r>
-    </w:p>
-    <w:p>
-      <w:pPr>
-        <w:rPr>
-          <w:b/>
-          <w:bCs/>
-        </w:rPr>
-      </w:pPr>
-      <w:r>
-        <w:rPr>
-          <w:b/>
-          <w:bCs/>
-        </w:rPr>
-        <w:lastRenderedPageBreak/>
+      <w:pPr>
+        <w:rPr>
+          <w:b/>
+          <w:bCs/>
+        </w:rPr>
+      </w:pPr>
+      <w:r>
+        <w:rPr>
+          <w:b/>
+          <w:bCs/>
+        </w:rPr>
         <w:t>CHALLENGE 9: Domain Propagation Delay</w:t>
       </w:r>
     </w:p>
@@ -2115,6 +1965,7 @@
         </w:numPr>
       </w:pPr>
       <w:r>
+        <w:lastRenderedPageBreak/>
         <w:t>Added a health check endpoint /</w:t>
       </w:r>
       <w:proofErr w:type="spellStart"/>
@@ -2135,13 +1986,6 @@
       </w:pPr>
       <w:r>
         <w:t>Documented that the first request may have a delay (cold start)</w:t>
-      </w:r>
-    </w:p>
-    <w:p>
-      <w:r>
-        <w:pict w14:anchorId="79DBCFF1">
-          <v:rect id="_x0000_i1100" style="width:0;height:.75pt" o:hralign="center" o:hrstd="t" o:hr="t" fillcolor="#a0a0a0" stroked="f"/>
-        </w:pict>
       </w:r>
     </w:p>
     <w:p>
@@ -2270,7 +2114,6 @@
           </w:tcPr>
           <w:p>
             <w:r>
-              <w:lastRenderedPageBreak/>
               <w:t>Area</w:t>
             </w:r>
           </w:p>
@@ -2535,28 +2378,6 @@
       </w:pPr>
       <w:r>
         <w:t>Tested using Chrome DevTools device emulator for iPhone and Android</w:t>
-      </w:r>
-    </w:p>
-    <w:p>
-      <w:r>
-        <w:pict w14:anchorId="00C546CB">
-          <v:rect id="_x0000_i1101" style="width:0;height:.75pt" o:hralign="center" o:hrstd="t" o:hr="t" fillcolor="#a0a0a0" stroked="f"/>
-        </w:pict>
-      </w:r>
-    </w:p>
-    <w:p>
-      <w:pPr>
-        <w:rPr>
-          <w:b/>
-          <w:bCs/>
-        </w:rPr>
-      </w:pPr>
-      <w:r>
-        <w:rPr>
-          <w:b/>
-          <w:bCs/>
-        </w:rPr>
-        <w:t>SUMMARY OF WHAT I LEARNED</w:t>
       </w:r>
     </w:p>
     <w:p/>
@@ -4698,6 +4519,7 @@
   <w:style w:type="character" w:default="1" w:styleId="DefaultParagraphFont">
     <w:name w:val="Default Paragraph Font"/>
     <w:uiPriority w:val="1"/>
+    <w:semiHidden/>
     <w:unhideWhenUsed/>
   </w:style>
   <w:style w:type="table" w:default="1" w:styleId="TableNormal">

</xml_diff>